<commit_message>
Add roll number (24B2454) and mentors (Sayandeep, Dhruv) to cover and README
</commit_message>
<xml_diff>
--- a/docs/UniVision_SOC_Midterm_Weeks1-6.docx
+++ b/docs/UniVision_SOC_Midterm_Weeks1-6.docx
@@ -49,6 +49,56 @@
         <w:gridCol w:w="4320"/>
         <w:gridCol w:w="4320"/>
       </w:tblGrid>
+      <w:tr>
+        <w:tc>
+          <w:tcPr>
+            <w:tcW w:type="dxa" w:w="4320"/>
+          </w:tcPr>
+          <w:p>
+            <w:r>
+              <w:rPr>
+                <w:b/>
+              </w:rPr>
+              <w:t>Roll Number</w:t>
+            </w:r>
+          </w:p>
+        </w:tc>
+        <w:tc>
+          <w:tcPr>
+            <w:tcW w:type="dxa" w:w="4320"/>
+          </w:tcPr>
+          <w:p>
+            <w:r>
+              <w:t>24B2454</w:t>
+            </w:r>
+          </w:p>
+        </w:tc>
+      </w:tr>
+      <w:tr>
+        <w:tc>
+          <w:tcPr>
+            <w:tcW w:type="dxa" w:w="4320"/>
+          </w:tcPr>
+          <w:p>
+            <w:r>
+              <w:rPr>
+                <w:b/>
+              </w:rPr>
+              <w:t>Mentors</w:t>
+            </w:r>
+          </w:p>
+        </w:tc>
+        <w:tc>
+          <w:tcPr>
+            <w:tcW w:type="dxa" w:w="4320"/>
+          </w:tcPr>
+          <w:p>
+            <w:r>
+              <w:t>Sayandeep and Dhruv</w:t>
+            </w:r>
+          </w:p>
+        </w:tc>
+      </w:tr>
       <w:tr>
         <w:tc>
           <w:tcPr>

</xml_diff>